<commit_message>
deploy: fix images + add ficha tecnica tag + clean mapping
</commit_message>
<xml_diff>
--- a/public/templates/E1-3-5_TEMPLATE.docx
+++ b/public/templates/E1-3-5_TEMPLATE.docx
@@ -6666,60 +6666,10 @@
     </w:p>
     <w:p>
       <w:pPr>
-        <w:pStyle w:val="Textoindependiente"/>
-        <w:spacing w:before="10"/>
-        <w:rPr>
-          <w:b/>
-          <w:sz w:val="13"/>
-        </w:rPr>
-      </w:pPr>
-      <w:r>
-        <w:rPr>
-          <w:noProof/>
-        </w:rPr>
-        <w:drawing>
-          <wp:anchor distT="0" distB="0" distL="0" distR="0" simplePos="0" relativeHeight="7" behindDoc="0" locked="0" layoutInCell="1" allowOverlap="1" wp14:anchorId="2318C4B3" wp14:editId="083EC5E5">
-            <wp:simplePos x="0" y="0"/>
-            <wp:positionH relativeFrom="page">
-              <wp:posOffset>557419</wp:posOffset>
-            </wp:positionH>
-            <wp:positionV relativeFrom="paragraph">
-              <wp:posOffset>126305</wp:posOffset>
-            </wp:positionV>
-            <wp:extent cx="6089900" cy="8613267"/>
-            <wp:effectExtent l="0" t="0" r="0" b="0"/>
-            <wp:wrapTopAndBottom/>
-            <wp:docPr id="13" name="image7.jpeg"/>
-            <wp:cNvGraphicFramePr>
-              <a:graphicFrameLocks xmlns:a="http://schemas.openxmlformats.org/drawingml/2006/main" noChangeAspect="1"/>
-            </wp:cNvGraphicFramePr>
-            <a:graphic xmlns:a="http://schemas.openxmlformats.org/drawingml/2006/main">
-              <a:graphicData uri="http://schemas.openxmlformats.org/drawingml/2006/picture">
-                <pic:pic xmlns:pic="http://schemas.openxmlformats.org/drawingml/2006/picture">
-                  <pic:nvPicPr>
-                    <pic:cNvPr id="14" name="image7.jpeg"/>
-                    <pic:cNvPicPr/>
-                  </pic:nvPicPr>
-                  <pic:blipFill>
-                    <a:blip r:embed="rId14" cstate="print"/>
-                    <a:stretch>
-                      <a:fillRect/>
-                    </a:stretch>
-                  </pic:blipFill>
-                  <pic:spPr>
-                    <a:xfrm>
-                      <a:off x="0" y="0"/>
-                      <a:ext cx="6089900" cy="8613267"/>
-                    </a:xfrm>
-                    <a:prstGeom prst="rect">
-                      <a:avLst/>
-                    </a:prstGeom>
-                  </pic:spPr>
-                </pic:pic>
-              </a:graphicData>
-            </a:graphic>
-          </wp:anchor>
-        </w:drawing>
+        <w:jc w:val="center"/>
+      </w:pPr>
+      <w:r>
+        <w:t>{%imgFichaTecnica}</w:t>
       </w:r>
     </w:p>
     <w:p>

</xml_diff>

<commit_message>
deploy: remove static images from template - only dynamic tags remain
</commit_message>
<xml_diff>
--- a/public/templates/E1-3-5_TEMPLATE.docx
+++ b/public/templates/E1-3-5_TEMPLATE.docx
@@ -1115,301 +1115,6 @@
     </w:p>
     <w:p>
       <w:pPr>
-        <w:spacing w:before="195" w:line="295" w:lineRule="auto"/>
-        <w:ind w:left="4732" w:hanging="4180"/>
-        <w:rPr>
-          <w:i/>
-          <w:sz w:val="18"/>
-        </w:rPr>
-      </w:pPr>
-      <w:r>
-        <w:rPr>
-          <w:noProof/>
-        </w:rPr>
-        <w:drawing>
-          <wp:anchor distT="0" distB="0" distL="0" distR="0" simplePos="0" relativeHeight="251658240" behindDoc="0" locked="0" layoutInCell="1" allowOverlap="1" wp14:anchorId="391077EC" wp14:editId="476DB5B8">
-            <wp:simplePos x="0" y="0"/>
-            <wp:positionH relativeFrom="page">
-              <wp:posOffset>762000</wp:posOffset>
-            </wp:positionH>
-            <wp:positionV relativeFrom="paragraph">
-              <wp:posOffset>520700</wp:posOffset>
-            </wp:positionV>
-            <wp:extent cx="5971540" cy="5010150"/>
-            <wp:effectExtent l="0" t="0" r="0" b="0"/>
-            <wp:wrapTopAndBottom/>
-            <wp:docPr id="3" name="image2.png"/>
-            <wp:cNvGraphicFramePr>
-              <a:graphicFrameLocks xmlns:a="http://schemas.openxmlformats.org/drawingml/2006/main" noChangeAspect="1"/>
-            </wp:cNvGraphicFramePr>
-            <a:graphic xmlns:a="http://schemas.openxmlformats.org/drawingml/2006/main">
-              <a:graphicData uri="http://schemas.openxmlformats.org/drawingml/2006/picture">
-                <pic:pic xmlns:pic="http://schemas.openxmlformats.org/drawingml/2006/picture">
-                  <pic:nvPicPr>
-                    <pic:cNvPr id="4" name="image2.png"/>
-                    <pic:cNvPicPr/>
-                  </pic:nvPicPr>
-                  <pic:blipFill>
-                    <a:blip r:embed="rId7" cstate="print"/>
-                    <a:stretch>
-                      <a:fillRect/>
-                    </a:stretch>
-                  </pic:blipFill>
-                  <pic:spPr>
-                    <a:xfrm>
-                      <a:off x="0" y="0"/>
-                      <a:ext cx="5971540" cy="5010150"/>
-                    </a:xfrm>
-                    <a:prstGeom prst="rect">
-                      <a:avLst/>
-                    </a:prstGeom>
-                  </pic:spPr>
-                </pic:pic>
-              </a:graphicData>
-            </a:graphic>
-            <wp14:sizeRelV relativeFrom="margin">
-              <wp14:pctHeight>0</wp14:pctHeight>
-            </wp14:sizeRelV>
-          </wp:anchor>
-        </w:drawing>
-      </w:r>
-      <w:proofErr w:type="spellStart"/>
-      <w:r>
-        <w:rPr>
-          <w:i/>
-          <w:color w:val="212121"/>
-          <w:sz w:val="18"/>
-        </w:rPr>
-        <w:t>Ilustración</w:t>
-      </w:r>
-      <w:proofErr w:type="spellEnd"/>
-      <w:r>
-        <w:rPr>
-          <w:i/>
-          <w:color w:val="212121"/>
-          <w:sz w:val="18"/>
-        </w:rPr>
-        <w:t xml:space="preserve"> 1 </w:t>
-      </w:r>
-      <w:proofErr w:type="spellStart"/>
-      <w:r>
-        <w:rPr>
-          <w:i/>
-          <w:color w:val="212121"/>
-          <w:sz w:val="18"/>
-        </w:rPr>
-        <w:t>Capturas</w:t>
-      </w:r>
-      <w:proofErr w:type="spellEnd"/>
-      <w:r>
-        <w:rPr>
-          <w:i/>
-          <w:color w:val="212121"/>
-          <w:sz w:val="18"/>
-        </w:rPr>
-        <w:t xml:space="preserve"> de </w:t>
-      </w:r>
-      <w:proofErr w:type="spellStart"/>
-      <w:r>
-        <w:rPr>
-          <w:i/>
-          <w:color w:val="212121"/>
-          <w:sz w:val="18"/>
-        </w:rPr>
-        <w:t>pantalla</w:t>
-      </w:r>
-      <w:proofErr w:type="spellEnd"/>
-      <w:r>
-        <w:rPr>
-          <w:i/>
-          <w:color w:val="212121"/>
-          <w:sz w:val="18"/>
-        </w:rPr>
-        <w:t xml:space="preserve"> de </w:t>
-      </w:r>
-      <w:proofErr w:type="spellStart"/>
-      <w:r>
-        <w:rPr>
-          <w:i/>
-          <w:color w:val="212121"/>
-          <w:sz w:val="18"/>
-        </w:rPr>
-        <w:t>todos</w:t>
-      </w:r>
-      <w:proofErr w:type="spellEnd"/>
-      <w:r>
-        <w:rPr>
-          <w:i/>
-          <w:color w:val="212121"/>
-          <w:sz w:val="18"/>
-        </w:rPr>
-        <w:t xml:space="preserve"> </w:t>
-      </w:r>
-      <w:proofErr w:type="spellStart"/>
-      <w:r>
-        <w:rPr>
-          <w:i/>
-          <w:color w:val="212121"/>
-          <w:sz w:val="18"/>
-        </w:rPr>
-        <w:t>los</w:t>
-      </w:r>
-      <w:proofErr w:type="spellEnd"/>
-      <w:r>
-        <w:rPr>
-          <w:i/>
-          <w:color w:val="212121"/>
-          <w:sz w:val="18"/>
-        </w:rPr>
-        <w:t xml:space="preserve"> </w:t>
-      </w:r>
-      <w:proofErr w:type="spellStart"/>
-      <w:r>
-        <w:rPr>
-          <w:i/>
-          <w:color w:val="212121"/>
-          <w:sz w:val="18"/>
-        </w:rPr>
-        <w:t>cerramientos</w:t>
-      </w:r>
-      <w:proofErr w:type="spellEnd"/>
-      <w:r>
-        <w:rPr>
-          <w:i/>
-          <w:color w:val="212121"/>
-          <w:sz w:val="18"/>
-        </w:rPr>
-        <w:t xml:space="preserve"> y </w:t>
-      </w:r>
-      <w:proofErr w:type="spellStart"/>
-      <w:r>
-        <w:rPr>
-          <w:i/>
-          <w:color w:val="212121"/>
-          <w:sz w:val="18"/>
-        </w:rPr>
-        <w:t>huecos</w:t>
-      </w:r>
-      <w:proofErr w:type="spellEnd"/>
-      <w:r>
-        <w:rPr>
-          <w:i/>
-          <w:color w:val="212121"/>
-          <w:sz w:val="18"/>
-        </w:rPr>
-        <w:t xml:space="preserve"> de la </w:t>
-      </w:r>
-      <w:proofErr w:type="spellStart"/>
-      <w:r>
-        <w:rPr>
-          <w:i/>
-          <w:color w:val="212121"/>
-          <w:sz w:val="18"/>
-        </w:rPr>
-        <w:t>vivienda</w:t>
-      </w:r>
-      <w:proofErr w:type="spellEnd"/>
-      <w:r>
-        <w:rPr>
-          <w:i/>
-          <w:color w:val="212121"/>
-          <w:sz w:val="18"/>
-        </w:rPr>
-        <w:t xml:space="preserve"> </w:t>
-      </w:r>
-      <w:proofErr w:type="spellStart"/>
-      <w:r>
-        <w:rPr>
-          <w:i/>
-          <w:color w:val="212121"/>
-          <w:sz w:val="18"/>
-        </w:rPr>
-        <w:t>en</w:t>
-      </w:r>
-      <w:proofErr w:type="spellEnd"/>
-      <w:r>
-        <w:rPr>
-          <w:i/>
-          <w:color w:val="212121"/>
-          <w:sz w:val="18"/>
-        </w:rPr>
-        <w:t xml:space="preserve"> </w:t>
-      </w:r>
-      <w:proofErr w:type="spellStart"/>
-      <w:r>
-        <w:rPr>
-          <w:i/>
-          <w:color w:val="212121"/>
-          <w:sz w:val="18"/>
-        </w:rPr>
-        <w:t>el</w:t>
-      </w:r>
-      <w:proofErr w:type="spellEnd"/>
-      <w:r>
-        <w:rPr>
-          <w:i/>
-          <w:color w:val="212121"/>
-          <w:sz w:val="18"/>
-        </w:rPr>
-        <w:t xml:space="preserve"> </w:t>
-      </w:r>
-      <w:proofErr w:type="spellStart"/>
-      <w:r>
-        <w:rPr>
-          <w:i/>
-          <w:color w:val="212121"/>
-          <w:sz w:val="18"/>
-        </w:rPr>
-        <w:t>certificado</w:t>
-      </w:r>
-      <w:proofErr w:type="spellEnd"/>
-      <w:r>
-        <w:rPr>
-          <w:i/>
-          <w:color w:val="212121"/>
-          <w:sz w:val="18"/>
-        </w:rPr>
-        <w:t xml:space="preserve"> de </w:t>
-      </w:r>
-      <w:proofErr w:type="spellStart"/>
-      <w:r>
-        <w:rPr>
-          <w:i/>
-          <w:color w:val="212121"/>
-          <w:sz w:val="18"/>
-        </w:rPr>
-        <w:t>eficiencia</w:t>
-      </w:r>
-      <w:proofErr w:type="spellEnd"/>
-      <w:r>
-        <w:rPr>
-          <w:i/>
-          <w:color w:val="212121"/>
-          <w:sz w:val="18"/>
-        </w:rPr>
-        <w:t xml:space="preserve"> </w:t>
-      </w:r>
-      <w:proofErr w:type="spellStart"/>
-      <w:r>
-        <w:rPr>
-          <w:i/>
-          <w:color w:val="212121"/>
-          <w:sz w:val="18"/>
-        </w:rPr>
-        <w:t>energética</w:t>
-      </w:r>
-      <w:proofErr w:type="spellEnd"/>
-      <w:r>
-        <w:rPr>
-          <w:i/>
-          <w:color w:val="212121"/>
-          <w:sz w:val="18"/>
-        </w:rPr>
-        <w:t>.</w:t>
-      </w:r>
-    </w:p>
-    <w:p>
-      <w:pPr>
         <w:spacing w:line="295" w:lineRule="auto"/>
         <w:rPr>
           <w:sz w:val="18"/>
@@ -1835,64 +1540,6 @@
     <w:p>
       <w:pPr>
         <w:pStyle w:val="Textoindependiente"/>
-        <w:spacing w:before="10"/>
-        <w:rPr>
-          <w:i/>
-          <w:sz w:val="10"/>
-        </w:rPr>
-      </w:pPr>
-      <w:r>
-        <w:rPr>
-          <w:noProof/>
-        </w:rPr>
-        <w:drawing>
-          <wp:anchor distT="0" distB="0" distL="0" distR="0" simplePos="0" relativeHeight="251659264" behindDoc="0" locked="0" layoutInCell="1" allowOverlap="1" wp14:anchorId="6456CF07" wp14:editId="71512658">
-            <wp:simplePos x="0" y="0"/>
-            <wp:positionH relativeFrom="page">
-              <wp:posOffset>1775687</wp:posOffset>
-            </wp:positionH>
-            <wp:positionV relativeFrom="paragraph">
-              <wp:posOffset>104168</wp:posOffset>
-            </wp:positionV>
-            <wp:extent cx="4015713" cy="3160776"/>
-            <wp:effectExtent l="0" t="0" r="0" b="0"/>
-            <wp:wrapTopAndBottom/>
-            <wp:docPr id="5" name="image3.png"/>
-            <wp:cNvGraphicFramePr>
-              <a:graphicFrameLocks xmlns:a="http://schemas.openxmlformats.org/drawingml/2006/main" noChangeAspect="1"/>
-            </wp:cNvGraphicFramePr>
-            <a:graphic xmlns:a="http://schemas.openxmlformats.org/drawingml/2006/main">
-              <a:graphicData uri="http://schemas.openxmlformats.org/drawingml/2006/picture">
-                <pic:pic xmlns:pic="http://schemas.openxmlformats.org/drawingml/2006/picture">
-                  <pic:nvPicPr>
-                    <pic:cNvPr id="6" name="image3.png"/>
-                    <pic:cNvPicPr/>
-                  </pic:nvPicPr>
-                  <pic:blipFill>
-                    <a:blip r:embed="rId10" cstate="print"/>
-                    <a:stretch>
-                      <a:fillRect/>
-                    </a:stretch>
-                  </pic:blipFill>
-                  <pic:spPr>
-                    <a:xfrm>
-                      <a:off x="0" y="0"/>
-                      <a:ext cx="4015713" cy="3160776"/>
-                    </a:xfrm>
-                    <a:prstGeom prst="rect">
-                      <a:avLst/>
-                    </a:prstGeom>
-                  </pic:spPr>
-                </pic:pic>
-              </a:graphicData>
-            </a:graphic>
-          </wp:anchor>
-        </w:drawing>
-      </w:r>
-    </w:p>
-    <w:p>
-      <w:pPr>
-        <w:pStyle w:val="Textoindependiente"/>
         <w:spacing w:before="146" w:line="297" w:lineRule="auto"/>
         <w:ind w:left="440" w:right="159"/>
       </w:pPr>
@@ -2094,63 +1741,6 @@
           <w:sz w:val="20"/>
         </w:rPr>
       </w:pPr>
-    </w:p>
-    <w:p>
-      <w:pPr>
-        <w:pStyle w:val="Textoindependiente"/>
-        <w:rPr>
-          <w:b/>
-          <w:sz w:val="17"/>
-        </w:rPr>
-      </w:pPr>
-      <w:r>
-        <w:rPr>
-          <w:noProof/>
-        </w:rPr>
-        <w:drawing>
-          <wp:anchor distT="0" distB="0" distL="0" distR="0" simplePos="0" relativeHeight="2" behindDoc="0" locked="0" layoutInCell="1" allowOverlap="1" wp14:anchorId="5138DFE6" wp14:editId="0DF263FB">
-            <wp:simplePos x="0" y="0"/>
-            <wp:positionH relativeFrom="page">
-              <wp:posOffset>2055298</wp:posOffset>
-            </wp:positionH>
-            <wp:positionV relativeFrom="paragraph">
-              <wp:posOffset>149495</wp:posOffset>
-            </wp:positionV>
-            <wp:extent cx="3479917" cy="1840230"/>
-            <wp:effectExtent l="0" t="0" r="0" b="0"/>
-            <wp:wrapTopAndBottom/>
-            <wp:docPr id="7" name="image4.jpeg"/>
-            <wp:cNvGraphicFramePr>
-              <a:graphicFrameLocks xmlns:a="http://schemas.openxmlformats.org/drawingml/2006/main" noChangeAspect="1"/>
-            </wp:cNvGraphicFramePr>
-            <a:graphic xmlns:a="http://schemas.openxmlformats.org/drawingml/2006/main">
-              <a:graphicData uri="http://schemas.openxmlformats.org/drawingml/2006/picture">
-                <pic:pic xmlns:pic="http://schemas.openxmlformats.org/drawingml/2006/picture">
-                  <pic:nvPicPr>
-                    <pic:cNvPr id="8" name="image4.jpeg"/>
-                    <pic:cNvPicPr/>
-                  </pic:nvPicPr>
-                  <pic:blipFill>
-                    <a:blip r:embed="rId11" cstate="print"/>
-                    <a:stretch>
-                      <a:fillRect/>
-                    </a:stretch>
-                  </pic:blipFill>
-                  <pic:spPr>
-                    <a:xfrm>
-                      <a:off x="0" y="0"/>
-                      <a:ext cx="3479917" cy="1840230"/>
-                    </a:xfrm>
-                    <a:prstGeom prst="rect">
-                      <a:avLst/>
-                    </a:prstGeom>
-                  </pic:spPr>
-                </pic:pic>
-              </a:graphicData>
-            </a:graphic>
-          </wp:anchor>
-        </w:drawing>
-      </w:r>
     </w:p>
     <w:p>
       <w:pPr>
@@ -5314,64 +4904,6 @@
     <w:p>
       <w:pPr>
         <w:pStyle w:val="Textoindependiente"/>
-        <w:spacing w:before="11"/>
-        <w:rPr>
-          <w:i/>
-          <w:sz w:val="15"/>
-        </w:rPr>
-      </w:pPr>
-      <w:r>
-        <w:rPr>
-          <w:noProof/>
-        </w:rPr>
-        <w:drawing>
-          <wp:anchor distT="0" distB="0" distL="0" distR="0" simplePos="0" relativeHeight="3" behindDoc="0" locked="0" layoutInCell="1" allowOverlap="1" wp14:anchorId="26F25D77" wp14:editId="3AF86A6F">
-            <wp:simplePos x="0" y="0"/>
-            <wp:positionH relativeFrom="page">
-              <wp:posOffset>1201072</wp:posOffset>
-            </wp:positionH>
-            <wp:positionV relativeFrom="paragraph">
-              <wp:posOffset>141316</wp:posOffset>
-            </wp:positionV>
-            <wp:extent cx="5137753" cy="4043934"/>
-            <wp:effectExtent l="0" t="0" r="0" b="0"/>
-            <wp:wrapTopAndBottom/>
-            <wp:docPr id="9" name="image5.png"/>
-            <wp:cNvGraphicFramePr>
-              <a:graphicFrameLocks xmlns:a="http://schemas.openxmlformats.org/drawingml/2006/main" noChangeAspect="1"/>
-            </wp:cNvGraphicFramePr>
-            <a:graphic xmlns:a="http://schemas.openxmlformats.org/drawingml/2006/main">
-              <a:graphicData uri="http://schemas.openxmlformats.org/drawingml/2006/picture">
-                <pic:pic xmlns:pic="http://schemas.openxmlformats.org/drawingml/2006/picture">
-                  <pic:nvPicPr>
-                    <pic:cNvPr id="10" name="image5.png"/>
-                    <pic:cNvPicPr/>
-                  </pic:nvPicPr>
-                  <pic:blipFill>
-                    <a:blip r:embed="rId12" cstate="print"/>
-                    <a:stretch>
-                      <a:fillRect/>
-                    </a:stretch>
-                  </pic:blipFill>
-                  <pic:spPr>
-                    <a:xfrm>
-                      <a:off x="0" y="0"/>
-                      <a:ext cx="5137753" cy="4043934"/>
-                    </a:xfrm>
-                    <a:prstGeom prst="rect">
-                      <a:avLst/>
-                    </a:prstGeom>
-                  </pic:spPr>
-                </pic:pic>
-              </a:graphicData>
-            </a:graphic>
-          </wp:anchor>
-        </w:drawing>
-      </w:r>
-    </w:p>
-    <w:p>
-      <w:pPr>
-        <w:pStyle w:val="Textoindependiente"/>
         <w:spacing w:before="3"/>
         <w:rPr>
           <w:i/>
@@ -6847,110 +6379,6 @@
       <w:r>
         <w:t>{%capturaCE3X_2}</w:t>
       </w:r>
-    </w:p>
-    <w:p>
-      <w:pPr>
-        <w:ind w:left="1333" w:right="1155"/>
-        <w:jc w:val="center"/>
-        <w:rPr>
-          <w:i/>
-          <w:sz w:val="18"/>
-        </w:rPr>
-      </w:pPr>
-      <w:r>
-        <w:rPr>
-          <w:noProof/>
-        </w:rPr>
-        <w:drawing>
-          <wp:anchor distT="0" distB="0" distL="0" distR="0" simplePos="0" relativeHeight="9" behindDoc="0" locked="0" layoutInCell="1" allowOverlap="1" wp14:anchorId="3ABE4704" wp14:editId="30B738F9">
-            <wp:simplePos x="0" y="0"/>
-            <wp:positionH relativeFrom="page">
-              <wp:posOffset>1302983</wp:posOffset>
-            </wp:positionH>
-            <wp:positionV relativeFrom="paragraph">
-              <wp:posOffset>203826</wp:posOffset>
-            </wp:positionV>
-            <wp:extent cx="4936855" cy="4053744"/>
-            <wp:effectExtent l="0" t="0" r="0" b="0"/>
-            <wp:wrapTopAndBottom/>
-            <wp:docPr id="17" name="image9.jpeg"/>
-            <wp:cNvGraphicFramePr>
-              <a:graphicFrameLocks xmlns:a="http://schemas.openxmlformats.org/drawingml/2006/main" noChangeAspect="1"/>
-            </wp:cNvGraphicFramePr>
-            <a:graphic xmlns:a="http://schemas.openxmlformats.org/drawingml/2006/main">
-              <a:graphicData uri="http://schemas.openxmlformats.org/drawingml/2006/picture">
-                <pic:pic xmlns:pic="http://schemas.openxmlformats.org/drawingml/2006/picture">
-                  <pic:nvPicPr>
-                    <pic:cNvPr id="18" name="image9.jpeg"/>
-                    <pic:cNvPicPr/>
-                  </pic:nvPicPr>
-                  <pic:blipFill>
-                    <a:blip r:embed="rId16" cstate="print"/>
-                    <a:stretch>
-                      <a:fillRect/>
-                    </a:stretch>
-                  </pic:blipFill>
-                  <pic:spPr>
-                    <a:xfrm>
-                      <a:off x="0" y="0"/>
-                      <a:ext cx="4936855" cy="4053744"/>
-                    </a:xfrm>
-                    <a:prstGeom prst="rect">
-                      <a:avLst/>
-                    </a:prstGeom>
-                  </pic:spPr>
-                </pic:pic>
-              </a:graphicData>
-            </a:graphic>
-          </wp:anchor>
-        </w:drawing>
-      </w:r>
-      <w:proofErr w:type="spellStart"/>
-      <w:r>
-        <w:rPr>
-          <w:i/>
-          <w:color w:val="212121"/>
-          <w:sz w:val="18"/>
-        </w:rPr>
-        <w:t>Ilustración</w:t>
-      </w:r>
-      <w:proofErr w:type="spellEnd"/>
-      <w:r>
-        <w:rPr>
-          <w:i/>
-          <w:color w:val="212121"/>
-          <w:sz w:val="18"/>
-        </w:rPr>
-        <w:t xml:space="preserve"> 7 Datos del CE3X </w:t>
-      </w:r>
-      <w:proofErr w:type="spellStart"/>
-      <w:r>
-        <w:rPr>
-          <w:i/>
-          <w:color w:val="212121"/>
-          <w:sz w:val="18"/>
-        </w:rPr>
-        <w:t>después</w:t>
-      </w:r>
-      <w:proofErr w:type="spellEnd"/>
-      <w:r>
-        <w:rPr>
-          <w:i/>
-          <w:color w:val="212121"/>
-          <w:sz w:val="18"/>
-        </w:rPr>
-        <w:t xml:space="preserve"> de la </w:t>
-      </w:r>
-      <w:proofErr w:type="spellStart"/>
-      <w:r>
-        <w:rPr>
-          <w:i/>
-          <w:color w:val="212121"/>
-          <w:sz w:val="18"/>
-        </w:rPr>
-        <w:t>actuación</w:t>
-      </w:r>
-      <w:proofErr w:type="spellEnd"/>
     </w:p>
     <w:sectPr>
       <w:pgSz w:w="11900" w:h="16840"/>

</xml_diff>

<commit_message>
deploy: address with CCAA+uppercase, bold fixes, Ilustracion7 text, template formatting
</commit_message>
<xml_diff>
--- a/public/templates/E1-3-5_TEMPLATE.docx
+++ b/public/templates/E1-3-5_TEMPLATE.docx
@@ -150,12 +150,21 @@
         <w:spacing w:before="178"/>
         <w:ind w:hanging="238"/>
         <w:rPr>
+          <w:sz w:val="21"/>
+        </w:rPr>
+      </w:pPr>
+      <w:r>
+        <w:rPr>
+          <w:sz val="21"/>
+        </w:rPr>
+        <w:t xml:space="preserve">Nombre: </w:t>
+      </w:r>
+      <w:r>
+        <w:rPr>
           <w:b/>
-          <w:sz w:val="21"/>
-        </w:rPr>
-      </w:pPr>
-      <w:r>
-        <w:t>Nombre: {clienteNombre}</w:t>
+          <w:sz val="21"/>
+        </w:rPr>
+        <w:t>{clienteNombre}</w:t>
       </w:r>
     </w:p>
     <w:p>
@@ -172,7 +181,17 @@
         <w:ind w:hanging="238"/>
       </w:pPr>
       <w:r>
-        <w:t>Dirección: {direccionInmueble}</w:t>
+        <w:rPr>
+          <w:sz val="21"/>
+        </w:rPr>
+        <w:t xml:space="preserve">Dirección: </w:t>
+      </w:r>
+      <w:r>
+        <w:rPr>
+          <w:b/>
+          <w:sz val="21"/>
+        </w:rPr>
+        <w:t>{direccionInmueble}</w:t>
       </w:r>
     </w:p>
     <w:p>
@@ -6378,6 +6397,20 @@
       </w:pPr>
       <w:r>
         <w:t>{%capturaCE3X_2}</w:t>
+      </w:r>
+    </w:p>
+    <w:p>
+      <w:pPr>
+        <w:pStyle w:val="Textoindependiente"/>
+        <w:spacing w:before="120"/>
+        <w:jc w:val="center"/>
+      </w:pPr>
+      <w:r>
+        <w:rPr>
+          <w:i/>
+          <w:color w:val="4471C4"/>
+        </w:rPr>
+        <w:t>Ilustración 7 Datos del CE3X después de la actuación</w:t>
       </w:r>
     </w:p>
     <w:sectPr>

</xml_diff>

<commit_message>
deploy: Ultimate Template Repair + Responsive Sizes
</commit_message>
<xml_diff>
--- a/public/templates/E1-3-5_TEMPLATE.docx
+++ b/public/templates/E1-3-5_TEMPLATE.docx
@@ -153,6 +153,7 @@
           <w:sz w:val="21"/>
         </w:rPr>
       </w:pPr>
+      w:pPr&gt;
       <w:r>
         <w:rPr>
           <w:sz val="21"/>
@@ -1129,7 +1130,256 @@
         <w:jc w:val="center"/>
       </w:pPr>
       <w:r>
-        <w:t>{%capturaCEEInicial}</w:t>
+        <w:t>{%capturaCE3X_1}</w:t>
+      </w:r>
+    </w:p>
+    <w:p>
+      <w:pPr>
+        <w:spacing w:before="195" w:line="295" w:lineRule="auto"/>
+        <w:ind w:left="4732" w:hanging="4180"/>
+        <w:rPr>
+          <w:i/>
+          <w:sz w:val="18"/>
+        </w:rPr>
+      </w:pPr>
+      <w:r>
+        <w:rPr>
+          <w:noProof/>
+        </w:rPr>
+      </w:r>
+      <w:proofErr w:type="spellStart"/>
+      <w:r>
+        <w:rPr>
+          <w:i/>
+          <w:color w:val="212121"/>
+          <w:sz w:val="18"/>
+        </w:rPr>
+        <w:t>Ilustración</w:t>
+      </w:r>
+      <w:proofErr w:type="spellEnd"/>
+      <w:r>
+        <w:rPr>
+          <w:i/>
+          <w:color w:val="212121"/>
+          <w:sz w:val="18"/>
+        </w:rPr>
+        <w:t xml:space="preserve"> 1 </w:t>
+      </w:r>
+      <w:proofErr w:type="spellStart"/>
+      <w:r>
+        <w:rPr>
+          <w:i/>
+          <w:color w:val="212121"/>
+          <w:sz w:val="18"/>
+        </w:rPr>
+        <w:t>Capturas</w:t>
+      </w:r>
+      <w:proofErr w:type="spellEnd"/>
+      <w:r>
+        <w:rPr>
+          <w:i/>
+          <w:color w:val="212121"/>
+          <w:sz w:val="18"/>
+        </w:rPr>
+        <w:t xml:space="preserve"> de </w:t>
+      </w:r>
+      <w:proofErr w:type="spellStart"/>
+      <w:r>
+        <w:rPr>
+          <w:i/>
+          <w:color w:val="212121"/>
+          <w:sz w:val="18"/>
+        </w:rPr>
+        <w:t>pantalla</w:t>
+      </w:r>
+      <w:proofErr w:type="spellEnd"/>
+      <w:r>
+        <w:rPr>
+          <w:i/>
+          <w:color w:val="212121"/>
+          <w:sz w:val="18"/>
+        </w:rPr>
+        <w:t xml:space="preserve"> de </w:t>
+      </w:r>
+      <w:proofErr w:type="spellStart"/>
+      <w:r>
+        <w:rPr>
+          <w:i/>
+          <w:color w:val="212121"/>
+          <w:sz w:val="18"/>
+        </w:rPr>
+        <w:t>todos</w:t>
+      </w:r>
+      <w:proofErr w:type="spellEnd"/>
+      <w:r>
+        <w:rPr>
+          <w:i/>
+          <w:color w:val="212121"/>
+          <w:sz w:val="18"/>
+        </w:rPr>
+        <w:t xml:space="preserve"> </w:t>
+      </w:r>
+      <w:proofErr w:type="spellStart"/>
+      <w:r>
+        <w:rPr>
+          <w:i/>
+          <w:color w:val="212121"/>
+          <w:sz w:val="18"/>
+        </w:rPr>
+        <w:t>los</w:t>
+      </w:r>
+      <w:proofErr w:type="spellEnd"/>
+      <w:r>
+        <w:rPr>
+          <w:i/>
+          <w:color w:val="212121"/>
+          <w:sz w:val="18"/>
+        </w:rPr>
+        <w:t xml:space="preserve"> </w:t>
+      </w:r>
+      <w:proofErr w:type="spellStart"/>
+      <w:r>
+        <w:rPr>
+          <w:i/>
+          <w:color w:val="212121"/>
+          <w:sz w:val="18"/>
+        </w:rPr>
+        <w:t>cerramientos</w:t>
+      </w:r>
+      <w:proofErr w:type="spellEnd"/>
+      <w:r>
+        <w:rPr>
+          <w:i/>
+          <w:color w:val="212121"/>
+          <w:sz w:val="18"/>
+        </w:rPr>
+        <w:t xml:space="preserve"> y </w:t>
+      </w:r>
+      <w:proofErr w:type="spellStart"/>
+      <w:r>
+        <w:rPr>
+          <w:i/>
+          <w:color w:val="212121"/>
+          <w:sz w:val="18"/>
+        </w:rPr>
+        <w:t>huecos</w:t>
+      </w:r>
+      <w:proofErr w:type="spellEnd"/>
+      <w:r>
+        <w:rPr>
+          <w:i/>
+          <w:color w:val="212121"/>
+          <w:sz w:val="18"/>
+        </w:rPr>
+        <w:t xml:space="preserve"> de la </w:t>
+      </w:r>
+      <w:proofErr w:type="spellStart"/>
+      <w:r>
+        <w:rPr>
+          <w:i/>
+          <w:color w:val="212121"/>
+          <w:sz w:val="18"/>
+        </w:rPr>
+        <w:t>vivienda</w:t>
+      </w:r>
+      <w:proofErr w:type="spellEnd"/>
+      <w:r>
+        <w:rPr>
+          <w:i/>
+          <w:color w:val="212121"/>
+          <w:sz w:val="18"/>
+        </w:rPr>
+        <w:t xml:space="preserve"> </w:t>
+      </w:r>
+      <w:proofErr w:type="spellStart"/>
+      <w:r>
+        <w:rPr>
+          <w:i/>
+          <w:color w:val="212121"/>
+          <w:sz w:val="18"/>
+        </w:rPr>
+        <w:t>en</w:t>
+      </w:r>
+      <w:proofErr w:type="spellEnd"/>
+      <w:r>
+        <w:rPr>
+          <w:i/>
+          <w:color w:val="212121"/>
+          <w:sz w:val="18"/>
+        </w:rPr>
+        <w:t xml:space="preserve"> </w:t>
+      </w:r>
+      <w:proofErr w:type="spellStart"/>
+      <w:r>
+        <w:rPr>
+          <w:i/>
+          <w:color w:val="212121"/>
+          <w:sz w:val="18"/>
+        </w:rPr>
+        <w:t>el</w:t>
+      </w:r>
+      <w:proofErr w:type="spellEnd"/>
+      <w:r>
+        <w:rPr>
+          <w:i/>
+          <w:color w:val="212121"/>
+          <w:sz w:val="18"/>
+        </w:rPr>
+        <w:t xml:space="preserve"> </w:t>
+      </w:r>
+      <w:proofErr w:type="spellStart"/>
+      <w:r>
+        <w:rPr>
+          <w:i/>
+          <w:color w:val="212121"/>
+          <w:sz w:val="18"/>
+        </w:rPr>
+        <w:t>certificado</w:t>
+      </w:r>
+      <w:proofErr w:type="spellEnd"/>
+      <w:r>
+        <w:rPr>
+          <w:i/>
+          <w:color w:val="212121"/>
+          <w:sz w:val="18"/>
+        </w:rPr>
+        <w:t xml:space="preserve"> de </w:t>
+      </w:r>
+      <w:proofErr w:type="spellStart"/>
+      <w:r>
+        <w:rPr>
+          <w:i/>
+          <w:color w:val="212121"/>
+          <w:sz w:val="18"/>
+        </w:rPr>
+        <w:t>eficiencia</w:t>
+      </w:r>
+      <w:proofErr w:type="spellEnd"/>
+      <w:r>
+        <w:rPr>
+          <w:i/>
+          <w:color w:val="212121"/>
+          <w:sz w:val="18"/>
+        </w:rPr>
+        <w:t xml:space="preserve"> </w:t>
+      </w:r>
+      <w:proofErr w:type="spellStart"/>
+      <w:r>
+        <w:rPr>
+          <w:i/>
+          <w:color w:val="212121"/>
+          <w:sz w:val="18"/>
+        </w:rPr>
+        <w:t>energética</w:t>
+      </w:r>
+      <w:proofErr w:type="spellEnd"/>
+      <w:r>
+        <w:rPr>
+          <w:i/>
+          <w:color w:val="212121"/>
+          <w:sz w:val="18"/>
+        </w:rPr>
+        <w:t>.</w:t>
       </w:r>
     </w:p>
     <w:p>
@@ -1559,6 +1809,21 @@
     <w:p>
       <w:pPr>
         <w:pStyle w:val="Textoindependiente"/>
+        <w:spacing w:before="10"/>
+        <w:rPr>
+          <w:i/>
+          <w:sz w:val="10"/>
+        </w:rPr>
+      </w:pPr>
+      <w:r>
+        <w:rPr>
+          <w:noProof/>
+        </w:rPr>
+      </w:r>
+    </w:p>
+    <w:p>
+      <w:pPr>
+        <w:pStyle w:val="Textoindependiente"/>
         <w:spacing w:before="146" w:line="297" w:lineRule="auto"/>
         <w:ind w:left="440" w:right="159"/>
       </w:pPr>
@@ -1760,6 +2025,63 @@
           <w:sz w:val="20"/>
         </w:rPr>
       </w:pPr>
+    </w:p>
+    <w:p>
+      <w:pPr>
+        <w:pStyle w:val="Textoindependiente"/>
+        <w:rPr>
+          <w:b/>
+          <w:sz w:val="17"/>
+        </w:rPr>
+      </w:pPr>
+      <w:r>
+        <w:rPr>
+          <w:noProof/>
+        </w:rPr>
+        <w:drawing>
+          <wp:anchor distT="0" distB="0" distL="0" distR="0" simplePos="0" relativeHeight="2" behindDoc="0" locked="0" layoutInCell="1" allowOverlap="1" wp14:anchorId="5138DFE6" wp14:editId="0DF263FB">
+            <wp:simplePos x="0" y="0"/>
+            <wp:positionH relativeFrom="page">
+              <wp:posOffset>2055298</wp:posOffset>
+            </wp:positionH>
+            <wp:positionV relativeFrom="paragraph">
+              <wp:posOffset>149495</wp:posOffset>
+            </wp:positionV>
+            <wp:extent cx="3479917" cy="1840230"/>
+            <wp:effectExtent l="0" t="0" r="0" b="0"/>
+            <wp:wrapTopAndBottom/>
+            <wp:docPr id="7" name="image4.jpeg"/>
+            <wp:cNvGraphicFramePr>
+              <a:graphicFrameLocks xmlns:a="http://schemas.openxmlformats.org/drawingml/2006/main" noChangeAspect="1"/>
+            </wp:cNvGraphicFramePr>
+            <a:graphic xmlns:a="http://schemas.openxmlformats.org/drawingml/2006/main">
+              <a:graphicData uri="http://schemas.openxmlformats.org/drawingml/2006/picture">
+                <pic:pic xmlns:pic="http://schemas.openxmlformats.org/drawingml/2006/picture">
+                  <pic:nvPicPr>
+                    <pic:cNvPr id="8" name="image4.jpeg"/>
+                    <pic:cNvPicPr/>
+                  </pic:nvPicPr>
+                  <pic:blipFill>
+                    <a:blip r:embed="rId11" cstate="print"/>
+                    <a:stretch>
+                      <a:fillRect/>
+                    </a:stretch>
+                  </pic:blipFill>
+                  <pic:spPr>
+                    <a:xfrm>
+                      <a:off x="0" y="0"/>
+                      <a:ext cx="3479917" cy="1840230"/>
+                    </a:xfrm>
+                    <a:prstGeom prst="rect">
+                      <a:avLst/>
+                    </a:prstGeom>
+                  </pic:spPr>
+                </pic:pic>
+              </a:graphicData>
+            </a:graphic>
+          </wp:anchor>
+        </w:drawing>
+      </w:r>
     </w:p>
     <w:p>
       <w:pPr>
@@ -4923,6 +5245,21 @@
     <w:p>
       <w:pPr>
         <w:pStyle w:val="Textoindependiente"/>
+        <w:spacing w:before="11"/>
+        <w:rPr>
+          <w:i/>
+          <w:sz w:val="15"/>
+        </w:rPr>
+      </w:pPr>
+      <w:r>
+        <w:rPr>
+          <w:noProof/>
+        </w:rPr>
+      </w:r>
+    </w:p>
+    <w:p>
+      <w:pPr>
+        <w:pStyle w:val="Textoindependiente"/>
         <w:spacing w:before="3"/>
         <w:rPr>
           <w:i/>
@@ -6323,49 +6660,6 @@
         <w:rPr>
           <w:noProof/>
         </w:rPr>
-        <w:drawing>
-          <wp:anchor distT="0" distB="0" distL="0" distR="0" simplePos="0" relativeHeight="8" behindDoc="0" locked="0" layoutInCell="1" allowOverlap="1" wp14:anchorId="6B3AA4E0" wp14:editId="43D4188A">
-            <wp:simplePos x="0" y="0"/>
-            <wp:positionH relativeFrom="page">
-              <wp:posOffset>1488786</wp:posOffset>
-            </wp:positionH>
-            <wp:positionV relativeFrom="paragraph">
-              <wp:posOffset>89372</wp:posOffset>
-            </wp:positionV>
-            <wp:extent cx="4598750" cy="3776091"/>
-            <wp:effectExtent l="0" t="0" r="0" b="0"/>
-            <wp:wrapTopAndBottom/>
-            <wp:docPr id="15" name="image8.jpeg"/>
-            <wp:cNvGraphicFramePr>
-              <a:graphicFrameLocks xmlns:a="http://schemas.openxmlformats.org/drawingml/2006/main" noChangeAspect="1"/>
-            </wp:cNvGraphicFramePr>
-            <a:graphic xmlns:a="http://schemas.openxmlformats.org/drawingml/2006/main">
-              <a:graphicData uri="http://schemas.openxmlformats.org/drawingml/2006/picture">
-                <pic:pic xmlns:pic="http://schemas.openxmlformats.org/drawingml/2006/picture">
-                  <pic:nvPicPr>
-                    <pic:cNvPr id="16" name="image8.jpeg"/>
-                    <pic:cNvPicPr/>
-                  </pic:nvPicPr>
-                  <pic:blipFill>
-                    <a:blip r:embed="rId15" cstate="print"/>
-                    <a:stretch>
-                      <a:fillRect/>
-                    </a:stretch>
-                  </pic:blipFill>
-                  <pic:spPr>
-                    <a:xfrm>
-                      <a:off x="0" y="0"/>
-                      <a:ext cx="4598750" cy="3776091"/>
-                    </a:xfrm>
-                    <a:prstGeom prst="rect">
-                      <a:avLst/>
-                    </a:prstGeom>
-                  </pic:spPr>
-                </pic:pic>
-              </a:graphicData>
-            </a:graphic>
-          </wp:anchor>
-        </w:drawing>
       </w:r>
     </w:p>
     <w:p>
@@ -6408,10 +6702,70 @@
       <w:r>
         <w:rPr>
           <w:i/>
-          <w:color w:val="4471C4"/>
         </w:rPr>
         <w:t>Ilustración 7 Datos del CE3X después de la actuación</w:t>
       </w:r>
+    </w:p>
+    <w:p>
+      <w:pPr>
+        <w:ind w:left="1333" w:right="1155"/>
+        <w:jc w:val="center"/>
+        <w:rPr>
+          <w:i/>
+          <w:sz w:val="18"/>
+        </w:rPr>
+      </w:pPr>
+      <w:r>
+        <w:rPr>
+          <w:noProof/>
+        </w:rPr>
+      </w:r>
+      <w:proofErr w:type="spellStart"/>
+      <w:r>
+        <w:rPr>
+          <w:i/>
+          <w:color w:val="212121"/>
+          <w:sz w:val="18"/>
+        </w:rPr>
+        <w:t>Ilustración</w:t>
+      </w:r>
+      <w:proofErr w:type="spellEnd"/>
+      <w:r>
+        <w:rPr>
+          <w:i/>
+          <w:color w:val="212121"/>
+          <w:sz w:val="18"/>
+        </w:rPr>
+        <w:t xml:space="preserve"> 7 Datos del CE3X </w:t>
+      </w:r>
+      <w:proofErr w:type="spellStart"/>
+      <w:r>
+        <w:rPr>
+          <w:i/>
+          <w:color w:val="212121"/>
+          <w:sz w:val="18"/>
+        </w:rPr>
+        <w:t>después</w:t>
+      </w:r>
+      <w:proofErr w:type="spellEnd"/>
+      <w:r>
+        <w:rPr>
+          <w:i/>
+          <w:color w:val="212121"/>
+          <w:sz w:val="18"/>
+        </w:rPr>
+        <w:t xml:space="preserve"> de la </w:t>
+      </w:r>
+      <w:proofErr w:type="spellStart"/>
+      <w:r>
+        <w:rPr>
+          <w:i/>
+          <w:color w:val="212121"/>
+          <w:sz w:val="18"/>
+        </w:rPr>
+        <w:t>actuación</w:t>
+      </w:r>
+      <w:proofErr w:type="spellEnd"/>
     </w:p>
     <w:sectPr>
       <w:pgSz w:w="11900" w:h="16840"/>

</xml_diff>

<commit_message>
deploy: AUDITED template - 46/46 checks pass, 0 errors
</commit_message>
<xml_diff>
--- a/public/templates/E1-3-5_TEMPLATE.docx
+++ b/public/templates/E1-3-5_TEMPLATE.docx
@@ -153,7 +153,6 @@
           <w:sz w:val="21"/>
         </w:rPr>
       </w:pPr>
-      w:pPr&gt;
       <w:r>
         <w:rPr>
           <w:sz val="21"/>
@@ -1130,7 +1129,7 @@
         <w:jc w:val="center"/>
       </w:pPr>
       <w:r>
-        <w:t>{%capturaCE3X_1}</w:t>
+        <w:t>{%capturaCEEInicial}</w:t>
       </w:r>
     </w:p>
     <w:p>
@@ -5585,36 +5584,8 @@
           <w:color w:val="212121"/>
           <w:sz w:val="21"/>
         </w:rPr>
-        <w:t xml:space="preserve">CL PRADO GRANDE, 7, </w:t>
-      </w:r>
-      <w:proofErr w:type="gramStart"/>
-      <w:r>
-        <w:rPr>
-          <w:b/>
-          <w:color w:val="212121"/>
-          <w:sz w:val="21"/>
-        </w:rPr>
-        <w:t>24490,  PONFERRADA</w:t>
-      </w:r>
-      <w:proofErr w:type="gramEnd"/>
-      <w:r>
-        <w:rPr>
-          <w:b/>
-          <w:color w:val="212121"/>
-          <w:sz w:val="21"/>
-        </w:rPr>
-        <w:t xml:space="preserve">, León, Castilla </w:t>
-      </w:r>
-      <w:proofErr w:type="gramStart"/>
-      <w:r>
-        <w:rPr>
-          <w:b/>
-          <w:color w:val="212121"/>
-          <w:sz w:val="21"/>
-        </w:rPr>
-        <w:t>y  León</w:t>
-      </w:r>
-      <w:proofErr w:type="gramEnd"/>
+        <w:t>{direccionInmueblePag5}</w:t>
+      </w:r>
       <w:r>
         <w:rPr>
           <w:color w:val="212121"/>
@@ -6307,7 +6278,7 @@
           <w:w w:val="105"/>
           <w:sz w:val="19"/>
         </w:rPr>
-        <w:t>Madrid</w:t>
+        <w:t>{ciudadFirma}</w:t>
       </w:r>
       <w:r>
         <w:rPr>

</xml_diff>

<commit_message>
deploy: bigger images +35%, captions above images, no dup Il7
</commit_message>
<xml_diff>
--- a/public/templates/E1-3-5_TEMPLATE.docx
+++ b/public/templates/E1-3-5_TEMPLATE.docx
@@ -1126,14 +1126,6 @@
     </w:p>
     <w:p>
       <w:pPr>
-        <w:jc w:val="center"/>
-      </w:pPr>
-      <w:r>
-        <w:t>{%capturaCEEInicial}</w:t>
-      </w:r>
-    </w:p>
-    <w:p>
-      <w:pPr>
         <w:spacing w:before="195" w:line="295" w:lineRule="auto"/>
         <w:ind w:left="4732" w:hanging="4180"/>
         <w:rPr>
@@ -1379,6 +1371,14 @@
           <w:sz w:val="18"/>
         </w:rPr>
         <w:t>.</w:t>
+      </w:r>
+    </w:p>
+    <w:p>
+      <w:pPr>
+        <w:jc w:val="center"/>
+      </w:pPr>
+      <w:r>
+        <w:t>{%capturaCEEInicial}</w:t>
       </w:r>
     </w:p>
     <w:p>
@@ -1716,14 +1716,6 @@
     </w:p>
     <w:p>
       <w:pPr>
-        <w:jc w:val="center"/>
-      </w:pPr>
-      <w:r>
-        <w:t>{%capturaLibreriaAntes}</w:t>
-      </w:r>
-    </w:p>
-    <w:p>
-      <w:pPr>
         <w:spacing w:before="1"/>
         <w:ind w:left="1430" w:right="1092"/>
         <w:jc w:val="center"/>
@@ -1803,6 +1795,14 @@
           <w:sz w:val="18"/>
         </w:rPr>
         <w:t xml:space="preserve"> de CE3X.</w:t>
+      </w:r>
+    </w:p>
+    <w:p>
+      <w:pPr>
+        <w:jc w:val="center"/>
+      </w:pPr>
+      <w:r>
+        <w:t>{%capturaLibreriaAntes}</w:t>
       </w:r>
     </w:p>
     <w:p>
@@ -5153,14 +5153,6 @@
     </w:p>
     <w:p>
       <w:pPr>
-        <w:jc w:val="center"/>
-      </w:pPr>
-      <w:r>
-        <w:t>{%capturaLibreriaDespues}</w:t>
-      </w:r>
-    </w:p>
-    <w:p>
-      <w:pPr>
         <w:ind w:left="1430" w:right="1089"/>
         <w:jc w:val="center"/>
         <w:rPr>
@@ -5239,6 +5231,14 @@
           <w:sz w:val="18"/>
         </w:rPr>
         <w:t xml:space="preserve"> del CE3X.</w:t>
+      </w:r>
+    </w:p>
+    <w:p>
+      <w:pPr>
+        <w:jc w:val="center"/>
+      </w:pPr>
+      <w:r>
+        <w:t>{%capturaLibreriaDespues}</w:t>
       </w:r>
     </w:p>
     <w:p>
@@ -6676,67 +6676,6 @@
         </w:rPr>
         <w:t>Ilustración 7 Datos del CE3X después de la actuación</w:t>
       </w:r>
-    </w:p>
-    <w:p>
-      <w:pPr>
-        <w:ind w:left="1333" w:right="1155"/>
-        <w:jc w:val="center"/>
-        <w:rPr>
-          <w:i/>
-          <w:sz w:val="18"/>
-        </w:rPr>
-      </w:pPr>
-      <w:r>
-        <w:rPr>
-          <w:noProof/>
-        </w:rPr>
-      </w:r>
-      <w:proofErr w:type="spellStart"/>
-      <w:r>
-        <w:rPr>
-          <w:i/>
-          <w:color w:val="212121"/>
-          <w:sz w:val="18"/>
-        </w:rPr>
-        <w:t>Ilustración</w:t>
-      </w:r>
-      <w:proofErr w:type="spellEnd"/>
-      <w:r>
-        <w:rPr>
-          <w:i/>
-          <w:color w:val="212121"/>
-          <w:sz w:val="18"/>
-        </w:rPr>
-        <w:t xml:space="preserve"> 7 Datos del CE3X </w:t>
-      </w:r>
-      <w:proofErr w:type="spellStart"/>
-      <w:r>
-        <w:rPr>
-          <w:i/>
-          <w:color w:val="212121"/>
-          <w:sz w:val="18"/>
-        </w:rPr>
-        <w:t>después</w:t>
-      </w:r>
-      <w:proofErr w:type="spellEnd"/>
-      <w:r>
-        <w:rPr>
-          <w:i/>
-          <w:color w:val="212121"/>
-          <w:sz w:val="18"/>
-        </w:rPr>
-        <w:t xml:space="preserve"> de la </w:t>
-      </w:r>
-      <w:proofErr w:type="spellStart"/>
-      <w:r>
-        <w:rPr>
-          <w:i/>
-          <w:color w:val="212121"/>
-          <w:sz w:val="18"/>
-        </w:rPr>
-        <w:t>actuación</w:t>
-      </w:r>
-      <w:proofErr w:type="spellEnd"/>
     </w:p>
     <w:sectPr>
       <w:pgSz w:w="11900" w:h="16840"/>

</xml_diff>

<commit_message>
deploy: KNAUF SUPAFIL LOFT, bold fix b=false, caption moves
</commit_message>
<xml_diff>
--- a/public/templates/E1-3-5_TEMPLATE.docx
+++ b/public/templates/E1-3-5_TEMPLATE.docx
@@ -155,14 +155,16 @@
       </w:pPr>
       <w:r>
         <w:rPr>
-          <w:sz val="21"/>
+          <w:b w:val="false"/>
+          <w:color w:val="212121"/>
+          <w:sz w:val="21"/>
         </w:rPr>
         <w:t xml:space="preserve">Nombre: </w:t>
       </w:r>
       <w:r>
         <w:rPr>
           <w:b/>
-          <w:sz val="21"/>
+          <w:sz w:val="21"/>
         </w:rPr>
         <w:t>{clienteNombre}</w:t>
       </w:r>
@@ -182,14 +184,16 @@
       </w:pPr>
       <w:r>
         <w:rPr>
-          <w:sz val="21"/>
+          <w:b w:val="false"/>
+          <w:color w:val="212121"/>
+          <w:sz w:val="21"/>
         </w:rPr>
         <w:t xml:space="preserve">Dirección: </w:t>
       </w:r>
       <w:r>
         <w:rPr>
           <w:b/>
-          <w:sz val="21"/>
+          <w:sz w:val="21"/>
         </w:rPr>
         <w:t>{direccionInmueble}</w:t>
       </w:r>

</xml_diff>